<commit_message>
style(p9): anti-AI em-dash pass on MIR title page + cover letter
Replace prose em-dashes with colons/commas in the P9 India MIR submission
title page and cover letter; preserve CRediT table placeholders and the
published book-title em-dash. Rebuild matching .docx via pandoc. Manuscript
prose was already em-dash-free (humanized earlier).

Co-Authored-By: Claude Opus 4.8 (1M context) <noreply@anthropic.com>
Claude-Session: https://claude.ai/code/session_01Xumaoraa2DLWLXsgJJ62oq
</commit_message>
<xml_diff>
--- a/SUBMISSION_PACKAGE/09_Paper_P9_India_MIR/02_title_page.docx
+++ b/SUBMISSION_PACKAGE/09_Paper_P9_India_MIR/02_title_page.docx
@@ -8,7 +8,7 @@
         <w:pStyle w:val="Heading1"/>
       </w:pPr>
       <w:r>
-        <w:t xml:space="preserve">Author Title Page — P9’ India</w:t>
+        <w:t xml:space="preserve">Author Title Page: P9 India</w:t>
       </w:r>
     </w:p>
     <w:p>
@@ -20,7 +20,7 @@
           <w:iCs/>
           <w:i/>
         </w:rPr>
-        <w:t xml:space="preserve">(Submitted separately from the blinded manuscript — not for review)</w:t>
+        <w:t xml:space="preserve">(Submitted separately from the blinded manuscript, not for review)</w:t>
       </w:r>
     </w:p>
     <w:bookmarkStart w:id="20" w:name="manuscript-title"/>
@@ -95,7 +95,7 @@
         <w:t xml:space="preserve"> </w:t>
       </w:r>
       <w:r>
-        <w:t xml:space="preserve">[TBD — after empirical analysis complete]</w:t>
+        <w:t xml:space="preserve">[TBD: after empirical analysis complete]</w:t>
       </w:r>
     </w:p>
     <w:p>
@@ -833,7 +833,7 @@
         <w:pStyle w:val="Heading2"/>
       </w:pPr>
       <w:r>
-        <w:t xml:space="preserve">Prior Related Work — Disclosure</w:t>
+        <w:t xml:space="preserve">Prior Related Work: Disclosure</w:t>
       </w:r>
     </w:p>
     <w:p>

</xml_diff>